<commit_message>
Readiness Word files rebuilt for the SQL Server Audit (DOC-S01, DOC-S08, DOC-S10, DOC-S11, DOC-S12, ADR 0012)
Co-Authored-By: Claude Opus 5.5 <noreply@anthropic.com>
Claude-Session: https://claude.ai/code/session_012HHcRrzuvMBTL2FYxXtsyv
</commit_message>
<xml_diff>
--- a/treasury-platform/docs/30-readiness/word/DOC-S01-threat-model.docx
+++ b/treasury-platform/docs/30-readiness/word/DOC-S01-threat-model.docx
@@ -21065,12 +21065,12 @@
         </w:tblBorders>
       </w:tblPr>
       <w:tblGrid>
-        <w:gridCol w:w="944"/>
-        <w:gridCol w:w="944"/>
-        <w:gridCol w:w="4020"/>
-        <w:gridCol w:w="1908"/>
-        <w:gridCol w:w="1104"/>
-        <w:gridCol w:w="944"/>
+        <w:gridCol w:w="939"/>
+        <w:gridCol w:w="939"/>
+        <w:gridCol w:w="3904"/>
+        <w:gridCol w:w="1853"/>
+        <w:gridCol w:w="1290"/>
+        <w:gridCol w:w="939"/>
       </w:tblGrid>
       <w:tr>
         <w:trPr>
@@ -21079,7 +21079,7 @@
         </w:trPr>
         <w:tc>
           <w:tcPr>
-            <w:tcW w:type="dxa" w:w="944"/>
+            <w:tcW w:type="dxa" w:w="939"/>
             <w:tcBorders>
               <w:top w:val="single" w:color="BFC9D6" w:sz="4"/>
               <w:left w:val="single" w:color="BFC9D6" w:sz="4"/>
@@ -21117,7 +21117,7 @@
         </w:tc>
         <w:tc>
           <w:tcPr>
-            <w:tcW w:type="dxa" w:w="944"/>
+            <w:tcW w:type="dxa" w:w="939"/>
             <w:tcBorders>
               <w:top w:val="single" w:color="BFC9D6" w:sz="4"/>
               <w:left w:val="single" w:color="BFC9D6" w:sz="4"/>
@@ -21155,7 +21155,7 @@
         </w:tc>
         <w:tc>
           <w:tcPr>
-            <w:tcW w:type="dxa" w:w="4020"/>
+            <w:tcW w:type="dxa" w:w="3904"/>
             <w:tcBorders>
               <w:top w:val="single" w:color="BFC9D6" w:sz="4"/>
               <w:left w:val="single" w:color="BFC9D6" w:sz="4"/>
@@ -21193,7 +21193,7 @@
         </w:tc>
         <w:tc>
           <w:tcPr>
-            <w:tcW w:type="dxa" w:w="1908"/>
+            <w:tcW w:type="dxa" w:w="1853"/>
             <w:tcBorders>
               <w:top w:val="single" w:color="BFC9D6" w:sz="4"/>
               <w:left w:val="single" w:color="BFC9D6" w:sz="4"/>
@@ -21231,7 +21231,7 @@
         </w:tc>
         <w:tc>
           <w:tcPr>
-            <w:tcW w:type="dxa" w:w="1104"/>
+            <w:tcW w:type="dxa" w:w="1290"/>
             <w:tcBorders>
               <w:top w:val="single" w:color="BFC9D6" w:sz="4"/>
               <w:left w:val="single" w:color="BFC9D6" w:sz="4"/>
@@ -21279,7 +21279,7 @@
         </w:tc>
         <w:tc>
           <w:tcPr>
-            <w:tcW w:type="dxa" w:w="944"/>
+            <w:tcW w:type="dxa" w:w="939"/>
             <w:tcBorders>
               <w:top w:val="single" w:color="BFC9D6" w:sz="4"/>
               <w:left w:val="single" w:color="BFC9D6" w:sz="4"/>
@@ -21322,7 +21322,7 @@
         </w:trPr>
         <w:tc>
           <w:tcPr>
-            <w:tcW w:type="dxa" w:w="944"/>
+            <w:tcW w:type="dxa" w:w="939"/>
             <w:tcBorders>
               <w:top w:val="single" w:color="BFC9D6" w:sz="4"/>
               <w:left w:val="single" w:color="BFC9D6" w:sz="4"/>
@@ -21358,7 +21358,7 @@
         </w:tc>
         <w:tc>
           <w:tcPr>
-            <w:tcW w:type="dxa" w:w="944"/>
+            <w:tcW w:type="dxa" w:w="939"/>
             <w:tcBorders>
               <w:top w:val="single" w:color="BFC9D6" w:sz="4"/>
               <w:left w:val="single" w:color="BFC9D6" w:sz="4"/>
@@ -21394,7 +21394,7 @@
         </w:tc>
         <w:tc>
           <w:tcPr>
-            <w:tcW w:type="dxa" w:w="4020"/>
+            <w:tcW w:type="dxa" w:w="3904"/>
             <w:tcBorders>
               <w:top w:val="single" w:color="BFC9D6" w:sz="4"/>
               <w:left w:val="single" w:color="BFC9D6" w:sz="4"/>
@@ -21430,7 +21430,7 @@
         </w:tc>
         <w:tc>
           <w:tcPr>
-            <w:tcW w:type="dxa" w:w="1908"/>
+            <w:tcW w:type="dxa" w:w="1853"/>
             <w:tcBorders>
               <w:top w:val="single" w:color="BFC9D6" w:sz="4"/>
               <w:left w:val="single" w:color="BFC9D6" w:sz="4"/>
@@ -21466,7 +21466,7 @@
         </w:tc>
         <w:tc>
           <w:tcPr>
-            <w:tcW w:type="dxa" w:w="1104"/>
+            <w:tcW w:type="dxa" w:w="1290"/>
             <w:tcBorders>
               <w:top w:val="single" w:color="BFC9D6" w:sz="4"/>
               <w:left w:val="single" w:color="BFC9D6" w:sz="4"/>
@@ -21502,7 +21502,7 @@
         </w:tc>
         <w:tc>
           <w:tcPr>
-            <w:tcW w:type="dxa" w:w="944"/>
+            <w:tcW w:type="dxa" w:w="939"/>
             <w:tcBorders>
               <w:top w:val="single" w:color="BFC9D6" w:sz="4"/>
               <w:left w:val="single" w:color="BFC9D6" w:sz="4"/>
@@ -21565,7 +21565,7 @@
         </w:trPr>
         <w:tc>
           <w:tcPr>
-            <w:tcW w:type="dxa" w:w="944"/>
+            <w:tcW w:type="dxa" w:w="939"/>
             <w:tcBorders>
               <w:top w:val="single" w:color="BFC9D6" w:sz="4"/>
               <w:left w:val="single" w:color="BFC9D6" w:sz="4"/>
@@ -21602,7 +21602,7 @@
         </w:tc>
         <w:tc>
           <w:tcPr>
-            <w:tcW w:type="dxa" w:w="944"/>
+            <w:tcW w:type="dxa" w:w="939"/>
             <w:tcBorders>
               <w:top w:val="single" w:color="BFC9D6" w:sz="4"/>
               <w:left w:val="single" w:color="BFC9D6" w:sz="4"/>
@@ -21639,7 +21639,7 @@
         </w:tc>
         <w:tc>
           <w:tcPr>
-            <w:tcW w:type="dxa" w:w="4020"/>
+            <w:tcW w:type="dxa" w:w="3904"/>
             <w:tcBorders>
               <w:top w:val="single" w:color="BFC9D6" w:sz="4"/>
               <w:left w:val="single" w:color="BFC9D6" w:sz="4"/>
@@ -21676,7 +21676,7 @@
         </w:tc>
         <w:tc>
           <w:tcPr>
-            <w:tcW w:type="dxa" w:w="1908"/>
+            <w:tcW w:type="dxa" w:w="1853"/>
             <w:tcBorders>
               <w:top w:val="single" w:color="BFC9D6" w:sz="4"/>
               <w:left w:val="single" w:color="BFC9D6" w:sz="4"/>
@@ -21726,7 +21726,7 @@
         </w:tc>
         <w:tc>
           <w:tcPr>
-            <w:tcW w:type="dxa" w:w="1104"/>
+            <w:tcW w:type="dxa" w:w="1290"/>
             <w:tcBorders>
               <w:top w:val="single" w:color="BFC9D6" w:sz="4"/>
               <w:left w:val="single" w:color="BFC9D6" w:sz="4"/>
@@ -21757,13 +21757,13 @@
                 <w:szCs w:val="18"/>
                 <w:rtl/>
               </w:rPr>
-              <w:t xml:space="preserve">SQL Server Audit يُشحن خارج VPS (DQ-S01-8)؛ مرساة دورية للسلسلة</w:t>
-            </w:r>
-          </w:p>
-        </w:tc>
-        <w:tc>
-          <w:tcPr>
-            <w:tcW w:type="dxa" w:w="944"/>
+              <w:t xml:space="preserve">SQL Server Audit يُشحن خارج VPS (DQ-S01-8؛ التدقيق وتنبيهاته منفّذة بـ ADR 0012، والشحن ينتظر DQ-S12-1)؛ مرساة دورية للسلسلة</w:t>
+            </w:r>
+          </w:p>
+        </w:tc>
+        <w:tc>
+          <w:tcPr>
+            <w:tcW w:type="dxa" w:w="939"/>
             <w:tcBorders>
               <w:top w:val="single" w:color="BFC9D6" w:sz="4"/>
               <w:left w:val="single" w:color="BFC9D6" w:sz="4"/>
@@ -25618,11 +25618,11 @@
         </w:tblBorders>
       </w:tblPr>
       <w:tblGrid>
-        <w:gridCol w:w="1540"/>
-        <w:gridCol w:w="2118"/>
-        <w:gridCol w:w="2548"/>
-        <w:gridCol w:w="1540"/>
-        <w:gridCol w:w="2118"/>
+        <w:gridCol w:w="1143"/>
+        <w:gridCol w:w="1572"/>
+        <w:gridCol w:w="4434"/>
+        <w:gridCol w:w="1143"/>
+        <w:gridCol w:w="1572"/>
       </w:tblGrid>
       <w:tr>
         <w:trPr>
@@ -25631,7 +25631,7 @@
         </w:trPr>
         <w:tc>
           <w:tcPr>
-            <w:tcW w:type="dxa" w:w="1540"/>
+            <w:tcW w:type="dxa" w:w="1143"/>
             <w:tcBorders>
               <w:top w:val="single" w:color="BFC9D6" w:sz="4"/>
               <w:left w:val="single" w:color="BFC9D6" w:sz="4"/>
@@ -25669,7 +25669,7 @@
         </w:tc>
         <w:tc>
           <w:tcPr>
-            <w:tcW w:type="dxa" w:w="2118"/>
+            <w:tcW w:type="dxa" w:w="1572"/>
             <w:tcBorders>
               <w:top w:val="single" w:color="BFC9D6" w:sz="4"/>
               <w:left w:val="single" w:color="BFC9D6" w:sz="4"/>
@@ -25707,7 +25707,7 @@
         </w:tc>
         <w:tc>
           <w:tcPr>
-            <w:tcW w:type="dxa" w:w="2548"/>
+            <w:tcW w:type="dxa" w:w="4434"/>
             <w:tcBorders>
               <w:top w:val="single" w:color="BFC9D6" w:sz="4"/>
               <w:left w:val="single" w:color="BFC9D6" w:sz="4"/>
@@ -25745,7 +25745,7 @@
         </w:tc>
         <w:tc>
           <w:tcPr>
-            <w:tcW w:type="dxa" w:w="1540"/>
+            <w:tcW w:type="dxa" w:w="1143"/>
             <w:tcBorders>
               <w:top w:val="single" w:color="BFC9D6" w:sz="4"/>
               <w:left w:val="single" w:color="BFC9D6" w:sz="4"/>
@@ -25783,7 +25783,7 @@
         </w:tc>
         <w:tc>
           <w:tcPr>
-            <w:tcW w:type="dxa" w:w="2118"/>
+            <w:tcW w:type="dxa" w:w="1572"/>
             <w:tcBorders>
               <w:top w:val="single" w:color="BFC9D6" w:sz="4"/>
               <w:left w:val="single" w:color="BFC9D6" w:sz="4"/>
@@ -25826,7 +25826,7 @@
         </w:trPr>
         <w:tc>
           <w:tcPr>
-            <w:tcW w:type="dxa" w:w="1540"/>
+            <w:tcW w:type="dxa" w:w="1143"/>
             <w:tcBorders>
               <w:top w:val="single" w:color="BFC9D6" w:sz="4"/>
               <w:left w:val="single" w:color="BFC9D6" w:sz="4"/>
@@ -25862,7 +25862,7 @@
         </w:tc>
         <w:tc>
           <w:tcPr>
-            <w:tcW w:type="dxa" w:w="2118"/>
+            <w:tcW w:type="dxa" w:w="1572"/>
             <w:tcBorders>
               <w:top w:val="single" w:color="BFC9D6" w:sz="4"/>
               <w:left w:val="single" w:color="BFC9D6" w:sz="4"/>
@@ -25898,7 +25898,7 @@
         </w:tc>
         <w:tc>
           <w:tcPr>
-            <w:tcW w:type="dxa" w:w="2548"/>
+            <w:tcW w:type="dxa" w:w="4434"/>
             <w:tcBorders>
               <w:top w:val="single" w:color="BFC9D6" w:sz="4"/>
               <w:left w:val="single" w:color="BFC9D6" w:sz="4"/>
@@ -25943,7 +25943,7 @@
         </w:tc>
         <w:tc>
           <w:tcPr>
-            <w:tcW w:type="dxa" w:w="1540"/>
+            <w:tcW w:type="dxa" w:w="1143"/>
             <w:tcBorders>
               <w:top w:val="single" w:color="BFC9D6" w:sz="4"/>
               <w:left w:val="single" w:color="BFC9D6" w:sz="4"/>
@@ -25979,7 +25979,7 @@
         </w:tc>
         <w:tc>
           <w:tcPr>
-            <w:tcW w:type="dxa" w:w="2118"/>
+            <w:tcW w:type="dxa" w:w="1572"/>
             <w:tcBorders>
               <w:top w:val="single" w:color="BFC9D6" w:sz="4"/>
               <w:left w:val="single" w:color="BFC9D6" w:sz="4"/>
@@ -26020,7 +26020,7 @@
         </w:trPr>
         <w:tc>
           <w:tcPr>
-            <w:tcW w:type="dxa" w:w="1540"/>
+            <w:tcW w:type="dxa" w:w="1143"/>
             <w:tcBorders>
               <w:top w:val="single" w:color="BFC9D6" w:sz="4"/>
               <w:left w:val="single" w:color="BFC9D6" w:sz="4"/>
@@ -26057,7 +26057,7 @@
         </w:tc>
         <w:tc>
           <w:tcPr>
-            <w:tcW w:type="dxa" w:w="2118"/>
+            <w:tcW w:type="dxa" w:w="1572"/>
             <w:tcBorders>
               <w:top w:val="single" w:color="BFC9D6" w:sz="4"/>
               <w:left w:val="single" w:color="BFC9D6" w:sz="4"/>
@@ -26094,7 +26094,7 @@
         </w:tc>
         <w:tc>
           <w:tcPr>
-            <w:tcW w:type="dxa" w:w="2548"/>
+            <w:tcW w:type="dxa" w:w="4434"/>
             <w:tcBorders>
               <w:top w:val="single" w:color="BFC9D6" w:sz="4"/>
               <w:left w:val="single" w:color="BFC9D6" w:sz="4"/>
@@ -26131,7 +26131,7 @@
         </w:tc>
         <w:tc>
           <w:tcPr>
-            <w:tcW w:type="dxa" w:w="1540"/>
+            <w:tcW w:type="dxa" w:w="1143"/>
             <w:tcBorders>
               <w:top w:val="single" w:color="BFC9D6" w:sz="4"/>
               <w:left w:val="single" w:color="BFC9D6" w:sz="4"/>
@@ -26168,7 +26168,7 @@
         </w:tc>
         <w:tc>
           <w:tcPr>
-            <w:tcW w:type="dxa" w:w="2118"/>
+            <w:tcW w:type="dxa" w:w="1572"/>
             <w:tcBorders>
               <w:top w:val="single" w:color="BFC9D6" w:sz="4"/>
               <w:left w:val="single" w:color="BFC9D6" w:sz="4"/>
@@ -26210,7 +26210,7 @@
         </w:trPr>
         <w:tc>
           <w:tcPr>
-            <w:tcW w:type="dxa" w:w="1540"/>
+            <w:tcW w:type="dxa" w:w="1143"/>
             <w:tcBorders>
               <w:top w:val="single" w:color="BFC9D6" w:sz="4"/>
               <w:left w:val="single" w:color="BFC9D6" w:sz="4"/>
@@ -26246,7 +26246,7 @@
         </w:tc>
         <w:tc>
           <w:tcPr>
-            <w:tcW w:type="dxa" w:w="2118"/>
+            <w:tcW w:type="dxa" w:w="1572"/>
             <w:tcBorders>
               <w:top w:val="single" w:color="BFC9D6" w:sz="4"/>
               <w:left w:val="single" w:color="BFC9D6" w:sz="4"/>
@@ -26282,7 +26282,7 @@
         </w:tc>
         <w:tc>
           <w:tcPr>
-            <w:tcW w:type="dxa" w:w="2548"/>
+            <w:tcW w:type="dxa" w:w="4434"/>
             <w:tcBorders>
               <w:top w:val="single" w:color="BFC9D6" w:sz="4"/>
               <w:left w:val="single" w:color="BFC9D6" w:sz="4"/>
@@ -26351,7 +26351,7 @@
         </w:tc>
         <w:tc>
           <w:tcPr>
-            <w:tcW w:type="dxa" w:w="1540"/>
+            <w:tcW w:type="dxa" w:w="1143"/>
             <w:tcBorders>
               <w:top w:val="single" w:color="BFC9D6" w:sz="4"/>
               <w:left w:val="single" w:color="BFC9D6" w:sz="4"/>
@@ -26387,7 +26387,7 @@
         </w:tc>
         <w:tc>
           <w:tcPr>
-            <w:tcW w:type="dxa" w:w="2118"/>
+            <w:tcW w:type="dxa" w:w="1572"/>
             <w:tcBorders>
               <w:top w:val="single" w:color="BFC9D6" w:sz="4"/>
               <w:left w:val="single" w:color="BFC9D6" w:sz="4"/>
@@ -26428,7 +26428,7 @@
         </w:trPr>
         <w:tc>
           <w:tcPr>
-            <w:tcW w:type="dxa" w:w="1540"/>
+            <w:tcW w:type="dxa" w:w="1143"/>
             <w:tcBorders>
               <w:top w:val="single" w:color="BFC9D6" w:sz="4"/>
               <w:left w:val="single" w:color="BFC9D6" w:sz="4"/>
@@ -26465,7 +26465,7 @@
         </w:tc>
         <w:tc>
           <w:tcPr>
-            <w:tcW w:type="dxa" w:w="2118"/>
+            <w:tcW w:type="dxa" w:w="1572"/>
             <w:tcBorders>
               <w:top w:val="single" w:color="BFC9D6" w:sz="4"/>
               <w:left w:val="single" w:color="BFC9D6" w:sz="4"/>
@@ -26526,7 +26526,7 @@
         </w:tc>
         <w:tc>
           <w:tcPr>
-            <w:tcW w:type="dxa" w:w="2548"/>
+            <w:tcW w:type="dxa" w:w="4434"/>
             <w:tcBorders>
               <w:top w:val="single" w:color="BFC9D6" w:sz="4"/>
               <w:left w:val="single" w:color="BFC9D6" w:sz="4"/>
@@ -26587,7 +26587,7 @@
         </w:tc>
         <w:tc>
           <w:tcPr>
-            <w:tcW w:type="dxa" w:w="1540"/>
+            <w:tcW w:type="dxa" w:w="1143"/>
             <w:tcBorders>
               <w:top w:val="single" w:color="BFC9D6" w:sz="4"/>
               <w:left w:val="single" w:color="BFC9D6" w:sz="4"/>
@@ -26624,7 +26624,7 @@
         </w:tc>
         <w:tc>
           <w:tcPr>
-            <w:tcW w:type="dxa" w:w="2118"/>
+            <w:tcW w:type="dxa" w:w="1572"/>
             <w:tcBorders>
               <w:top w:val="single" w:color="BFC9D6" w:sz="4"/>
               <w:left w:val="single" w:color="BFC9D6" w:sz="4"/>
@@ -26666,7 +26666,7 @@
         </w:trPr>
         <w:tc>
           <w:tcPr>
-            <w:tcW w:type="dxa" w:w="1540"/>
+            <w:tcW w:type="dxa" w:w="1143"/>
             <w:tcBorders>
               <w:top w:val="single" w:color="BFC9D6" w:sz="4"/>
               <w:left w:val="single" w:color="BFC9D6" w:sz="4"/>
@@ -26702,7 +26702,7 @@
         </w:tc>
         <w:tc>
           <w:tcPr>
-            <w:tcW w:type="dxa" w:w="2118"/>
+            <w:tcW w:type="dxa" w:w="1572"/>
             <w:tcBorders>
               <w:top w:val="single" w:color="BFC9D6" w:sz="4"/>
               <w:left w:val="single" w:color="BFC9D6" w:sz="4"/>
@@ -26762,7 +26762,7 @@
         </w:tc>
         <w:tc>
           <w:tcPr>
-            <w:tcW w:type="dxa" w:w="2548"/>
+            <w:tcW w:type="dxa" w:w="4434"/>
             <w:tcBorders>
               <w:top w:val="single" w:color="BFC9D6" w:sz="4"/>
               <w:left w:val="single" w:color="BFC9D6" w:sz="4"/>
@@ -26798,7 +26798,7 @@
         </w:tc>
         <w:tc>
           <w:tcPr>
-            <w:tcW w:type="dxa" w:w="1540"/>
+            <w:tcW w:type="dxa" w:w="1143"/>
             <w:tcBorders>
               <w:top w:val="single" w:color="BFC9D6" w:sz="4"/>
               <w:left w:val="single" w:color="BFC9D6" w:sz="4"/>
@@ -26834,7 +26834,7 @@
         </w:tc>
         <w:tc>
           <w:tcPr>
-            <w:tcW w:type="dxa" w:w="2118"/>
+            <w:tcW w:type="dxa" w:w="1572"/>
             <w:tcBorders>
               <w:top w:val="single" w:color="BFC9D6" w:sz="4"/>
               <w:left w:val="single" w:color="BFC9D6" w:sz="4"/>
@@ -26875,7 +26875,7 @@
         </w:trPr>
         <w:tc>
           <w:tcPr>
-            <w:tcW w:type="dxa" w:w="1540"/>
+            <w:tcW w:type="dxa" w:w="1143"/>
             <w:tcBorders>
               <w:top w:val="single" w:color="BFC9D6" w:sz="4"/>
               <w:left w:val="single" w:color="BFC9D6" w:sz="4"/>
@@ -26912,7 +26912,7 @@
         </w:tc>
         <w:tc>
           <w:tcPr>
-            <w:tcW w:type="dxa" w:w="2118"/>
+            <w:tcW w:type="dxa" w:w="1572"/>
             <w:tcBorders>
               <w:top w:val="single" w:color="BFC9D6" w:sz="4"/>
               <w:left w:val="single" w:color="BFC9D6" w:sz="4"/>
@@ -26949,7 +26949,7 @@
         </w:tc>
         <w:tc>
           <w:tcPr>
-            <w:tcW w:type="dxa" w:w="2548"/>
+            <w:tcW w:type="dxa" w:w="4434"/>
             <w:tcBorders>
               <w:top w:val="single" w:color="BFC9D6" w:sz="4"/>
               <w:left w:val="single" w:color="BFC9D6" w:sz="4"/>
@@ -26995,7 +26995,7 @@
         </w:tc>
         <w:tc>
           <w:tcPr>
-            <w:tcW w:type="dxa" w:w="1540"/>
+            <w:tcW w:type="dxa" w:w="1143"/>
             <w:tcBorders>
               <w:top w:val="single" w:color="BFC9D6" w:sz="4"/>
               <w:left w:val="single" w:color="BFC9D6" w:sz="4"/>
@@ -27032,7 +27032,7 @@
         </w:tc>
         <w:tc>
           <w:tcPr>
-            <w:tcW w:type="dxa" w:w="2118"/>
+            <w:tcW w:type="dxa" w:w="1572"/>
             <w:tcBorders>
               <w:top w:val="single" w:color="BFC9D6" w:sz="4"/>
               <w:left w:val="single" w:color="BFC9D6" w:sz="4"/>
@@ -27074,7 +27074,7 @@
         </w:trPr>
         <w:tc>
           <w:tcPr>
-            <w:tcW w:type="dxa" w:w="1540"/>
+            <w:tcW w:type="dxa" w:w="1143"/>
             <w:tcBorders>
               <w:top w:val="single" w:color="BFC9D6" w:sz="4"/>
               <w:left w:val="single" w:color="BFC9D6" w:sz="4"/>
@@ -27110,7 +27110,7 @@
         </w:tc>
         <w:tc>
           <w:tcPr>
-            <w:tcW w:type="dxa" w:w="2118"/>
+            <w:tcW w:type="dxa" w:w="1572"/>
             <w:tcBorders>
               <w:top w:val="single" w:color="BFC9D6" w:sz="4"/>
               <w:left w:val="single" w:color="BFC9D6" w:sz="4"/>
@@ -27146,7 +27146,7 @@
         </w:tc>
         <w:tc>
           <w:tcPr>
-            <w:tcW w:type="dxa" w:w="2548"/>
+            <w:tcW w:type="dxa" w:w="4434"/>
             <w:tcBorders>
               <w:top w:val="single" w:color="BFC9D6" w:sz="4"/>
               <w:left w:val="single" w:color="BFC9D6" w:sz="4"/>
@@ -27182,7 +27182,7 @@
         </w:tc>
         <w:tc>
           <w:tcPr>
-            <w:tcW w:type="dxa" w:w="1540"/>
+            <w:tcW w:type="dxa" w:w="1143"/>
             <w:tcBorders>
               <w:top w:val="single" w:color="BFC9D6" w:sz="4"/>
               <w:left w:val="single" w:color="BFC9D6" w:sz="4"/>
@@ -27218,7 +27218,7 @@
         </w:tc>
         <w:tc>
           <w:tcPr>
-            <w:tcW w:type="dxa" w:w="2118"/>
+            <w:tcW w:type="dxa" w:w="1572"/>
             <w:tcBorders>
               <w:top w:val="single" w:color="BFC9D6" w:sz="4"/>
               <w:left w:val="single" w:color="BFC9D6" w:sz="4"/>
@@ -27259,7 +27259,7 @@
         </w:trPr>
         <w:tc>
           <w:tcPr>
-            <w:tcW w:type="dxa" w:w="1540"/>
+            <w:tcW w:type="dxa" w:w="1143"/>
             <w:tcBorders>
               <w:top w:val="single" w:color="BFC9D6" w:sz="4"/>
               <w:left w:val="single" w:color="BFC9D6" w:sz="4"/>
@@ -27296,7 +27296,7 @@
         </w:tc>
         <w:tc>
           <w:tcPr>
-            <w:tcW w:type="dxa" w:w="2118"/>
+            <w:tcW w:type="dxa" w:w="1572"/>
             <w:tcBorders>
               <w:top w:val="single" w:color="BFC9D6" w:sz="4"/>
               <w:left w:val="single" w:color="BFC9D6" w:sz="4"/>
@@ -27333,7 +27333,7 @@
         </w:tc>
         <w:tc>
           <w:tcPr>
-            <w:tcW w:type="dxa" w:w="2548"/>
+            <w:tcW w:type="dxa" w:w="4434"/>
             <w:tcBorders>
               <w:top w:val="single" w:color="BFC9D6" w:sz="4"/>
               <w:left w:val="single" w:color="BFC9D6" w:sz="4"/>
@@ -27364,13 +27364,33 @@
                 <w:szCs w:val="18"/>
                 <w:rtl/>
               </w:rPr>
-              <w:t xml:space="preserve">نعم، بملف يُشحن خارج VPS</w:t>
-            </w:r>
-          </w:p>
-        </w:tc>
-        <w:tc>
-          <w:tcPr>
-            <w:tcW w:type="dxa" w:w="1540"/>
+              <w:t xml:space="preserve">نعم، بملف يُشحن خارج VPS. </w:t>
+            </w:r>
+            <w:r>
+              <w:rPr>
+                <w:rFonts w:ascii="Segoe UI Emoji" w:cs="Segoe UI Emoji" w:eastAsia="Segoe UI Emoji" w:hAnsi="Segoe UI Emoji"/>
+                <w:sz w:val="18"/>
+                <w:szCs w:val="18"/>
+                <w:rtl/>
+              </w:rPr>
+              <w:t xml:space="preserve">✅</w:t>
+            </w:r>
+            <w:r>
+              <w:rPr>
+                <w:rFonts w:ascii="Arial" w:cs="Arial" w:eastAsia="Arial" w:hAnsi="Arial"/>
+                <w:b w:val="false"/>
+                <w:bCs w:val="false"/>
+                <w:sz w:val="18"/>
+                <w:szCs w:val="18"/>
+                <w:rtl/>
+              </w:rPr>
+              <w:t xml:space="preserve"> منفّذ (2026-10-13، docs/adr/0012-server-audit.md): التدقيق ومواصفتاه وتنبيهات AL-18؛ الشحن ينتظر DQ-S12-1 وDQ-S12-2</w:t>
+            </w:r>
+          </w:p>
+        </w:tc>
+        <w:tc>
+          <w:tcPr>
+            <w:tcW w:type="dxa" w:w="1143"/>
             <w:tcBorders>
               <w:top w:val="single" w:color="BFC9D6" w:sz="4"/>
               <w:left w:val="single" w:color="BFC9D6" w:sz="4"/>
@@ -27407,7 +27427,7 @@
         </w:tc>
         <w:tc>
           <w:tcPr>
-            <w:tcW w:type="dxa" w:w="2118"/>
+            <w:tcW w:type="dxa" w:w="1572"/>
             <w:tcBorders>
               <w:top w:val="single" w:color="BFC9D6" w:sz="4"/>
               <w:left w:val="single" w:color="BFC9D6" w:sz="4"/>

</xml_diff>

<commit_message>
Readiness Word files rebuilt for the monitoring login and the deployment checks (ADR 0013)
Co-Authored-By: Claude Opus 5.5 <noreply@anthropic.com>
Claude-Session: https://claude.ai/code/session_012HHcRrzuvMBTL2FYxXtsyv
</commit_message>
<xml_diff>
--- a/treasury-platform/docs/30-readiness/word/DOC-S01-threat-model.docx
+++ b/treasury-platform/docs/30-readiness/word/DOC-S01-threat-model.docx
@@ -16779,12 +16779,12 @@
         </w:tblBorders>
       </w:tblPr>
       <w:tblGrid>
-        <w:gridCol w:w="896"/>
-        <w:gridCol w:w="896"/>
-        <w:gridCol w:w="3739"/>
-        <w:gridCol w:w="2464"/>
-        <w:gridCol w:w="973"/>
-        <w:gridCol w:w="896"/>
+        <w:gridCol w:w="931"/>
+        <w:gridCol w:w="931"/>
+        <w:gridCol w:w="4732"/>
+        <w:gridCol w:w="1107"/>
+        <w:gridCol w:w="1232"/>
+        <w:gridCol w:w="931"/>
       </w:tblGrid>
       <w:tr>
         <w:trPr>
@@ -16793,7 +16793,7 @@
         </w:trPr>
         <w:tc>
           <w:tcPr>
-            <w:tcW w:type="dxa" w:w="896"/>
+            <w:tcW w:type="dxa" w:w="931"/>
             <w:tcBorders>
               <w:top w:val="single" w:color="BFC9D6" w:sz="4"/>
               <w:left w:val="single" w:color="BFC9D6" w:sz="4"/>
@@ -16831,7 +16831,7 @@
         </w:tc>
         <w:tc>
           <w:tcPr>
-            <w:tcW w:type="dxa" w:w="896"/>
+            <w:tcW w:type="dxa" w:w="931"/>
             <w:tcBorders>
               <w:top w:val="single" w:color="BFC9D6" w:sz="4"/>
               <w:left w:val="single" w:color="BFC9D6" w:sz="4"/>
@@ -16869,7 +16869,7 @@
         </w:tc>
         <w:tc>
           <w:tcPr>
-            <w:tcW w:type="dxa" w:w="3739"/>
+            <w:tcW w:type="dxa" w:w="4732"/>
             <w:tcBorders>
               <w:top w:val="single" w:color="BFC9D6" w:sz="4"/>
               <w:left w:val="single" w:color="BFC9D6" w:sz="4"/>
@@ -16907,7 +16907,7 @@
         </w:tc>
         <w:tc>
           <w:tcPr>
-            <w:tcW w:type="dxa" w:w="2464"/>
+            <w:tcW w:type="dxa" w:w="1107"/>
             <w:tcBorders>
               <w:top w:val="single" w:color="BFC9D6" w:sz="4"/>
               <w:left w:val="single" w:color="BFC9D6" w:sz="4"/>
@@ -16945,7 +16945,7 @@
         </w:tc>
         <w:tc>
           <w:tcPr>
-            <w:tcW w:type="dxa" w:w="973"/>
+            <w:tcW w:type="dxa" w:w="1232"/>
             <w:tcBorders>
               <w:top w:val="single" w:color="BFC9D6" w:sz="4"/>
               <w:left w:val="single" w:color="BFC9D6" w:sz="4"/>
@@ -16993,7 +16993,7 @@
         </w:tc>
         <w:tc>
           <w:tcPr>
-            <w:tcW w:type="dxa" w:w="896"/>
+            <w:tcW w:type="dxa" w:w="931"/>
             <w:tcBorders>
               <w:top w:val="single" w:color="BFC9D6" w:sz="4"/>
               <w:left w:val="single" w:color="BFC9D6" w:sz="4"/>
@@ -17036,7 +17036,7 @@
         </w:trPr>
         <w:tc>
           <w:tcPr>
-            <w:tcW w:type="dxa" w:w="896"/>
+            <w:tcW w:type="dxa" w:w="931"/>
             <w:tcBorders>
               <w:top w:val="single" w:color="BFC9D6" w:sz="4"/>
               <w:left w:val="single" w:color="BFC9D6" w:sz="4"/>
@@ -17072,7 +17072,7 @@
         </w:tc>
         <w:tc>
           <w:tcPr>
-            <w:tcW w:type="dxa" w:w="896"/>
+            <w:tcW w:type="dxa" w:w="931"/>
             <w:tcBorders>
               <w:top w:val="single" w:color="BFC9D6" w:sz="4"/>
               <w:left w:val="single" w:color="BFC9D6" w:sz="4"/>
@@ -17132,73 +17132,37 @@
         </w:tc>
         <w:tc>
           <w:tcPr>
-            <w:tcW w:type="dxa" w:w="3739"/>
-            <w:tcBorders>
-              <w:top w:val="single" w:color="BFC9D6" w:sz="4"/>
-              <w:left w:val="single" w:color="BFC9D6" w:sz="4"/>
-              <w:bottom w:val="single" w:color="BFC9D6" w:sz="4"/>
-              <w:right w:val="single" w:color="BFC9D6" w:sz="4"/>
-            </w:tcBorders>
-            <w:tcMar>
-              <w:top w:type="dxa" w:w="50"/>
-              <w:left w:type="dxa" w:w="90"/>
-              <w:bottom w:type="dxa" w:w="50"/>
-              <w:right w:type="dxa" w:w="90"/>
-            </w:tcMar>
-            <w:vAlign w:val="top"/>
-          </w:tcPr>
-          <w:p>
-            <w:pPr>
-              <w:keepNext w:val="false"/>
-              <w:bidi/>
-              <w:spacing w:after="30" w:before="30" w:line="264"/>
-            </w:pPr>
-            <w:r>
-              <w:rPr>
-                <w:rFonts w:ascii="Arial" w:cs="Arial" w:eastAsia="Arial" w:hAnsi="Arial"/>
-                <w:b w:val="false"/>
-                <w:bCs w:val="false"/>
-                <w:sz w:val="18"/>
-                <w:szCs w:val="18"/>
-                <w:rtl/>
-              </w:rPr>
-              <w:t xml:space="preserve">السكربت يرفض بلا كلمة مرور (tools/deploy/deploy.sh:21-23)</w:t>
-            </w:r>
-          </w:p>
-        </w:tc>
-        <w:tc>
-          <w:tcPr>
-            <w:tcW w:type="dxa" w:w="2464"/>
-            <w:tcBorders>
-              <w:top w:val="single" w:color="BFC9D6" w:sz="4"/>
-              <w:left w:val="single" w:color="BFC9D6" w:sz="4"/>
-              <w:bottom w:val="single" w:color="BFC9D6" w:sz="4"/>
-              <w:right w:val="single" w:color="BFC9D6" w:sz="4"/>
-            </w:tcBorders>
-            <w:tcMar>
-              <w:top w:type="dxa" w:w="50"/>
-              <w:left w:type="dxa" w:w="90"/>
-              <w:bottom w:type="dxa" w:w="50"/>
-              <w:right w:type="dxa" w:w="90"/>
-            </w:tcMar>
-            <w:vAlign w:val="top"/>
-          </w:tcPr>
-          <w:p>
-            <w:pPr>
-              <w:keepNext w:val="false"/>
-              <w:bidi/>
-              <w:spacing w:after="30" w:before="30" w:line="264"/>
-            </w:pPr>
-            <w:r>
-              <w:rPr>
-                <w:rFonts w:ascii="Arial" w:cs="Arial" w:eastAsia="Arial" w:hAnsi="Arial"/>
-                <w:b w:val="false"/>
-                <w:bCs w:val="false"/>
-                <w:sz w:val="18"/>
-                <w:szCs w:val="18"/>
-                <w:rtl/>
-              </w:rPr>
-              <w:t xml:space="preserve">الافتراضي </w:t>
+            <w:tcW w:type="dxa" w:w="4732"/>
+            <w:tcBorders>
+              <w:top w:val="single" w:color="BFC9D6" w:sz="4"/>
+              <w:left w:val="single" w:color="BFC9D6" w:sz="4"/>
+              <w:bottom w:val="single" w:color="BFC9D6" w:sz="4"/>
+              <w:right w:val="single" w:color="BFC9D6" w:sz="4"/>
+            </w:tcBorders>
+            <w:tcMar>
+              <w:top w:type="dxa" w:w="50"/>
+              <w:left w:type="dxa" w:w="90"/>
+              <w:bottom w:type="dxa" w:w="50"/>
+              <w:right w:type="dxa" w:w="90"/>
+            </w:tcMar>
+            <w:vAlign w:val="top"/>
+          </w:tcPr>
+          <w:p>
+            <w:pPr>
+              <w:keepNext w:val="false"/>
+              <w:bidi/>
+              <w:spacing w:after="30" w:before="30" w:line="264"/>
+            </w:pPr>
+            <w:r>
+              <w:rPr>
+                <w:rFonts w:ascii="Arial" w:cs="Arial" w:eastAsia="Arial" w:hAnsi="Arial"/>
+                <w:b w:val="false"/>
+                <w:bCs w:val="false"/>
+                <w:sz w:val="18"/>
+                <w:szCs w:val="18"/>
+                <w:rtl/>
+              </w:rPr>
+              <w:t xml:space="preserve">السكربت يرفض بلا كلمة مرور (tools/deploy/deploy.sh:21-23)؛ النشر بـ </w:t>
             </w:r>
             <w:r>
               <w:rPr>
@@ -17211,18 +17175,18 @@
                 <w:shd w:fill="F1F3F5" w:color="auto" w:val="clear"/>
                 <w:rtl/>
               </w:rPr>
-              <w:t xml:space="preserve">‎sa‎</w:t>
-            </w:r>
-            <w:r>
-              <w:rPr>
-                <w:rFonts w:ascii="Arial" w:cs="Arial" w:eastAsia="Arial" w:hAnsi="Arial"/>
-                <w:b w:val="false"/>
-                <w:bCs w:val="false"/>
-                <w:sz w:val="18"/>
-                <w:szCs w:val="18"/>
-                <w:rtl/>
-              </w:rPr>
-              <w:t xml:space="preserve"> و</w:t>
+              <w:t xml:space="preserve">‎bankfas_migrator‎</w:t>
+            </w:r>
+            <w:r>
+              <w:rPr>
+                <w:rFonts w:ascii="Arial" w:cs="Arial" w:eastAsia="Arial" w:hAnsi="Arial"/>
+                <w:b w:val="false"/>
+                <w:bCs w:val="false"/>
+                <w:sz w:val="18"/>
+                <w:szCs w:val="18"/>
+                <w:rtl/>
+              </w:rPr>
+              <w:t xml:space="preserve"> عضو </w:t>
             </w:r>
             <w:r>
               <w:rPr>
@@ -17235,24 +17199,84 @@
                 <w:shd w:fill="F1F3F5" w:color="auto" w:val="clear"/>
                 <w:rtl/>
               </w:rPr>
-              <w:t xml:space="preserve">‎-C‎</w:t>
-            </w:r>
-            <w:r>
-              <w:rPr>
-                <w:rFonts w:ascii="Arial" w:cs="Arial" w:eastAsia="Arial" w:hAnsi="Arial"/>
-                <w:b w:val="false"/>
-                <w:bCs w:val="false"/>
-                <w:sz w:val="18"/>
-                <w:szCs w:val="18"/>
-                <w:rtl/>
-              </w:rPr>
-              <w:t xml:space="preserve"> (tools/deploy/deploy.sh:17-19)؛ اعتراض الاتصال أو سكربت معدّل يعني سيطرة كاملة</w:t>
-            </w:r>
-          </w:p>
-        </w:tc>
-        <w:tc>
-          <w:tcPr>
-            <w:tcW w:type="dxa" w:w="973"/>
+              <w:t xml:space="preserve">‎db_owner‎</w:t>
+            </w:r>
+            <w:r>
+              <w:rPr>
+                <w:rFonts w:ascii="Arial" w:cs="Arial" w:eastAsia="Arial" w:hAnsi="Arial"/>
+                <w:b w:val="false"/>
+                <w:bCs w:val="false"/>
+                <w:sz w:val="18"/>
+                <w:szCs w:val="18"/>
+                <w:rtl/>
+              </w:rPr>
+              <w:t xml:space="preserve"> وحده (ADR 0010)؛ ولا أداة تثق بأي شهادة من تلقاء نفسها، ويحرس CI ذلك (ADR 0013، DQ-S05-7)</w:t>
+            </w:r>
+          </w:p>
+        </w:tc>
+        <w:tc>
+          <w:tcPr>
+            <w:tcW w:type="dxa" w:w="1107"/>
+            <w:tcBorders>
+              <w:top w:val="single" w:color="BFC9D6" w:sz="4"/>
+              <w:left w:val="single" w:color="BFC9D6" w:sz="4"/>
+              <w:bottom w:val="single" w:color="BFC9D6" w:sz="4"/>
+              <w:right w:val="single" w:color="BFC9D6" w:sz="4"/>
+            </w:tcBorders>
+            <w:tcMar>
+              <w:top w:type="dxa" w:w="50"/>
+              <w:left w:type="dxa" w:w="90"/>
+              <w:bottom w:type="dxa" w:w="50"/>
+              <w:right w:type="dxa" w:w="90"/>
+            </w:tcMar>
+            <w:vAlign w:val="top"/>
+          </w:tcPr>
+          <w:p>
+            <w:pPr>
+              <w:keepNext w:val="false"/>
+              <w:bidi/>
+              <w:spacing w:after="30" w:before="30" w:line="264"/>
+            </w:pPr>
+            <w:r>
+              <w:rPr>
+                <w:rFonts w:ascii="Arial" w:cs="Arial" w:eastAsia="Arial" w:hAnsi="Arial"/>
+                <w:b w:val="false"/>
+                <w:bCs w:val="false"/>
+                <w:sz w:val="18"/>
+                <w:szCs w:val="18"/>
+                <w:rtl/>
+              </w:rPr>
+              <w:t xml:space="preserve">الافتراضي </w:t>
+            </w:r>
+            <w:r>
+              <w:rPr>
+                <w:rFonts w:ascii="Courier New" w:cs="Courier New" w:eastAsia="Courier New" w:hAnsi="Courier New"/>
+                <w:b w:val="false"/>
+                <w:bCs w:val="false"/>
+                <w:color w:val="1F2937"/>
+                <w:sz w:val="16"/>
+                <w:szCs w:val="16"/>
+                <w:shd w:fill="F1F3F5" w:color="auto" w:val="clear"/>
+                <w:rtl/>
+              </w:rPr>
+              <w:t xml:space="preserve">‎sa‎</w:t>
+            </w:r>
+            <w:r>
+              <w:rPr>
+                <w:rFonts w:ascii="Arial" w:cs="Arial" w:eastAsia="Arial" w:hAnsi="Arial"/>
+                <w:b w:val="false"/>
+                <w:bCs w:val="false"/>
+                <w:sz w:val="18"/>
+                <w:szCs w:val="18"/>
+                <w:rtl/>
+              </w:rPr>
+              <w:t xml:space="preserve"> باقٍ في الغلاف (DQ-S11-6)؛ سكربت معدّل يعني سيطرة كاملة</w:t>
+            </w:r>
+          </w:p>
+        </w:tc>
+        <w:tc>
+          <w:tcPr>
+            <w:tcW w:type="dxa" w:w="1232"/>
             <w:tcBorders>
               <w:top w:val="single" w:color="BFC9D6" w:sz="4"/>
               <w:left w:val="single" w:color="BFC9D6" w:sz="4"/>
@@ -17288,7 +17312,7 @@
         </w:tc>
         <w:tc>
           <w:tcPr>
-            <w:tcW w:type="dxa" w:w="896"/>
+            <w:tcW w:type="dxa" w:w="931"/>
             <w:tcBorders>
               <w:top w:val="single" w:color="BFC9D6" w:sz="4"/>
               <w:left w:val="single" w:color="BFC9D6" w:sz="4"/>
@@ -17351,7 +17375,7 @@
         </w:trPr>
         <w:tc>
           <w:tcPr>
-            <w:tcW w:type="dxa" w:w="896"/>
+            <w:tcW w:type="dxa" w:w="931"/>
             <w:tcBorders>
               <w:top w:val="single" w:color="BFC9D6" w:sz="4"/>
               <w:left w:val="single" w:color="BFC9D6" w:sz="4"/>
@@ -17388,7 +17412,7 @@
         </w:tc>
         <w:tc>
           <w:tcPr>
-            <w:tcW w:type="dxa" w:w="896"/>
+            <w:tcW w:type="dxa" w:w="931"/>
             <w:tcBorders>
               <w:top w:val="single" w:color="BFC9D6" w:sz="4"/>
               <w:left w:val="single" w:color="BFC9D6" w:sz="4"/>
@@ -17425,7 +17449,7 @@
         </w:tc>
         <w:tc>
           <w:tcPr>
-            <w:tcW w:type="dxa" w:w="3739"/>
+            <w:tcW w:type="dxa" w:w="4732"/>
             <w:tcBorders>
               <w:top w:val="single" w:color="BFC9D6" w:sz="4"/>
               <w:left w:val="single" w:color="BFC9D6" w:sz="4"/>
@@ -17462,7 +17486,7 @@
         </w:tc>
         <w:tc>
           <w:tcPr>
-            <w:tcW w:type="dxa" w:w="2464"/>
+            <w:tcW w:type="dxa" w:w="1107"/>
             <w:tcBorders>
               <w:top w:val="single" w:color="BFC9D6" w:sz="4"/>
               <w:left w:val="single" w:color="BFC9D6" w:sz="4"/>
@@ -17499,7 +17523,7 @@
         </w:tc>
         <w:tc>
           <w:tcPr>
-            <w:tcW w:type="dxa" w:w="973"/>
+            <w:tcW w:type="dxa" w:w="1232"/>
             <w:tcBorders>
               <w:top w:val="single" w:color="BFC9D6" w:sz="4"/>
               <w:left w:val="single" w:color="BFC9D6" w:sz="4"/>
@@ -17536,7 +17560,7 @@
         </w:tc>
         <w:tc>
           <w:tcPr>
-            <w:tcW w:type="dxa" w:w="896"/>
+            <w:tcW w:type="dxa" w:w="931"/>
             <w:tcBorders>
               <w:top w:val="single" w:color="BFC9D6" w:sz="4"/>
               <w:left w:val="single" w:color="BFC9D6" w:sz="4"/>

</xml_diff>